<commit_message>
doc(CdC) : mise à jour
Ajout du CdC complet
</commit_message>
<xml_diff>
--- a/P_DB106_GRP2C.docx
+++ b/P_DB106_GRP2C.docx
@@ -2990,6 +2990,262 @@
               <w:t>Toutes ces requêtes doivent être présentées dans le rapport.</w:t>
             </w:r>
           </w:p>
+          <w:p>
+            <w:pPr>
+              <w:rPr>
+                <w:rFonts w:ascii="Century Gothic" w:hAnsi="Century Gothic"/>
+              </w:rPr>
+            </w:pPr>
+          </w:p>
+          <w:p>
+            <w:pPr>
+              <w:pStyle w:val="Titre3"/>
+            </w:pPr>
+            <w:r>
+              <w:t>Index</w:t>
+            </w:r>
+          </w:p>
+          <w:p>
+            <w:pPr>
+              <w:rPr>
+                <w:rFonts w:ascii="Century Gothic" w:hAnsi="Century Gothic"/>
+              </w:rPr>
+            </w:pPr>
+            <w:r>
+              <w:rPr>
+                <w:rFonts w:ascii="Century Gothic" w:hAnsi="Century Gothic"/>
+              </w:rPr>
+              <w:t>Soit les 2 requêtes suivantes :</w:t>
+            </w:r>
+          </w:p>
+          <w:p>
+            <w:pPr>
+              <w:rPr>
+                <w:rFonts w:ascii="Century Gothic" w:hAnsi="Century Gothic"/>
+              </w:rPr>
+            </w:pPr>
+          </w:p>
+          <w:p>
+            <w:pPr>
+              <w:rPr>
+                <w:rFonts w:ascii="Century Gothic" w:hAnsi="Century Gothic"/>
+              </w:rPr>
+            </w:pPr>
+            <w:r>
+              <w:rPr>
+                <w:rFonts w:ascii="Century Gothic" w:hAnsi="Century Gothic"/>
+              </w:rPr>
+              <w:t>Requête n°1:</w:t>
+            </w:r>
+          </w:p>
+          <w:p>
+            <w:pPr>
+              <w:rPr>
+                <w:rFonts w:ascii="Century Gothic" w:hAnsi="Century Gothic"/>
+              </w:rPr>
+            </w:pPr>
+          </w:p>
+          <w:p>
+            <w:pPr>
+              <w:shd w:val="clear" w:color="auto" w:fill="E8E8E8" w:themeFill="background2"/>
+              <w:rPr>
+                <w:rFonts w:ascii="Century Gothic" w:hAnsi="Century Gothic"/>
+              </w:rPr>
+            </w:pPr>
+            <w:r>
+              <w:rPr>
+                <w:rFonts w:ascii="Century Gothic" w:hAnsi="Century Gothic"/>
+              </w:rPr>
+              <w:t>SELECT c.commande_id, c.date_creation, c.statut, cl.nom AS client</w:t>
+            </w:r>
+          </w:p>
+          <w:p>
+            <w:pPr>
+              <w:shd w:val="clear" w:color="auto" w:fill="E8E8E8" w:themeFill="background2"/>
+              <w:rPr>
+                <w:rFonts w:ascii="Century Gothic" w:hAnsi="Century Gothic"/>
+              </w:rPr>
+            </w:pPr>
+            <w:r>
+              <w:rPr>
+                <w:rFonts w:ascii="Century Gothic" w:hAnsi="Century Gothic"/>
+              </w:rPr>
+              <w:t>FROM t_commande AS c</w:t>
+            </w:r>
+          </w:p>
+          <w:p>
+            <w:pPr>
+              <w:shd w:val="clear" w:color="auto" w:fill="E8E8E8" w:themeFill="background2"/>
+              <w:rPr>
+                <w:rFonts w:ascii="Century Gothic" w:hAnsi="Century Gothic"/>
+              </w:rPr>
+            </w:pPr>
+            <w:r>
+              <w:rPr>
+                <w:rFonts w:ascii="Century Gothic" w:hAnsi="Century Gothic"/>
+              </w:rPr>
+              <w:t>JOIN t_client AS cl ON c.client_fk = cl.client_id</w:t>
+            </w:r>
+          </w:p>
+          <w:p>
+            <w:pPr>
+              <w:shd w:val="clear" w:color="auto" w:fill="E8E8E8" w:themeFill="background2"/>
+              <w:rPr>
+                <w:rFonts w:ascii="Century Gothic" w:hAnsi="Century Gothic"/>
+                <w:lang w:val="en-US"/>
+              </w:rPr>
+            </w:pPr>
+            <w:r>
+              <w:rPr>
+                <w:rFonts w:ascii="Century Gothic" w:hAnsi="Century Gothic"/>
+                <w:lang w:val="en-US"/>
+              </w:rPr>
+              <w:t>WHERE c.statut = 'en_livraison' AND c.date_creation &gt; '2025-01-01'</w:t>
+            </w:r>
+          </w:p>
+          <w:p>
+            <w:pPr>
+              <w:shd w:val="clear" w:color="auto" w:fill="E8E8E8" w:themeFill="background2"/>
+              <w:rPr>
+                <w:rFonts w:ascii="Century Gothic" w:hAnsi="Century Gothic"/>
+                <w:lang w:val="en-US"/>
+              </w:rPr>
+            </w:pPr>
+            <w:r>
+              <w:rPr>
+                <w:rFonts w:ascii="Century Gothic" w:hAnsi="Century Gothic"/>
+                <w:lang w:val="en-US"/>
+              </w:rPr>
+              <w:t>ORDER BY c.date_creation DESC;</w:t>
+            </w:r>
+          </w:p>
+          <w:p>
+            <w:pPr>
+              <w:rPr>
+                <w:rFonts w:ascii="Century Gothic" w:hAnsi="Century Gothic"/>
+                <w:lang w:val="en-US"/>
+              </w:rPr>
+            </w:pPr>
+            <w:r>
+              <w:rPr>
+                <w:rFonts w:ascii="Century Gothic" w:hAnsi="Century Gothic"/>
+                <w:lang w:val="en-US"/>
+              </w:rPr>
+              <w:t>Requête n°2 :</w:t>
+            </w:r>
+          </w:p>
+          <w:p>
+            <w:pPr>
+              <w:rPr>
+                <w:rFonts w:ascii="Century Gothic" w:hAnsi="Century Gothic"/>
+                <w:lang w:val="en-US"/>
+              </w:rPr>
+            </w:pPr>
+          </w:p>
+          <w:p>
+            <w:pPr>
+              <w:shd w:val="clear" w:color="auto" w:fill="E8E8E8" w:themeFill="background2"/>
+              <w:rPr>
+                <w:rFonts w:ascii="Century Gothic" w:hAnsi="Century Gothic"/>
+                <w:lang w:val="en-US"/>
+              </w:rPr>
+            </w:pPr>
+            <w:r>
+              <w:rPr>
+                <w:rFonts w:ascii="Century Gothic" w:hAnsi="Century Gothic"/>
+                <w:lang w:val="en-US"/>
+              </w:rPr>
+              <w:t>SELECT a.npa AS zone_npa, COUNT(c.commande_id) AS nb</w:t>
+            </w:r>
+          </w:p>
+          <w:p>
+            <w:pPr>
+              <w:shd w:val="clear" w:color="auto" w:fill="E8E8E8" w:themeFill="background2"/>
+              <w:rPr>
+                <w:rFonts w:ascii="Century Gothic" w:hAnsi="Century Gothic"/>
+                <w:lang w:val="en-US"/>
+              </w:rPr>
+            </w:pPr>
+            <w:r>
+              <w:rPr>
+                <w:rFonts w:ascii="Century Gothic" w:hAnsi="Century Gothic"/>
+                <w:lang w:val="en-US"/>
+              </w:rPr>
+              <w:t>FROM t_commande AS c</w:t>
+            </w:r>
+          </w:p>
+          <w:p>
+            <w:pPr>
+              <w:shd w:val="clear" w:color="auto" w:fill="E8E8E8" w:themeFill="background2"/>
+              <w:rPr>
+                <w:rFonts w:ascii="Century Gothic" w:hAnsi="Century Gothic"/>
+                <w:lang w:val="en-US"/>
+              </w:rPr>
+            </w:pPr>
+            <w:r>
+              <w:rPr>
+                <w:rFonts w:ascii="Century Gothic" w:hAnsi="Century Gothic"/>
+                <w:lang w:val="en-US"/>
+              </w:rPr>
+              <w:t>JOIN t_adresse AS a ON c.adresse_livraison_fk = a.adresse_id</w:t>
+            </w:r>
+          </w:p>
+          <w:p>
+            <w:pPr>
+              <w:shd w:val="clear" w:color="auto" w:fill="E8E8E8" w:themeFill="background2"/>
+              <w:rPr>
+                <w:rFonts w:ascii="Century Gothic" w:hAnsi="Century Gothic"/>
+                <w:lang w:val="en-US"/>
+              </w:rPr>
+            </w:pPr>
+            <w:r>
+              <w:rPr>
+                <w:rFonts w:ascii="Century Gothic" w:hAnsi="Century Gothic"/>
+                <w:lang w:val="en-US"/>
+              </w:rPr>
+              <w:t>WHERE c.type = 'livraison' AND HOUR(c.date_creation) BETWEEN 18 AND 21</w:t>
+            </w:r>
+          </w:p>
+          <w:p>
+            <w:pPr>
+              <w:shd w:val="clear" w:color="auto" w:fill="E8E8E8" w:themeFill="background2"/>
+              <w:rPr>
+                <w:rFonts w:ascii="Century Gothic" w:hAnsi="Century Gothic"/>
+                <w:lang w:val="en-US"/>
+              </w:rPr>
+            </w:pPr>
+            <w:r>
+              <w:rPr>
+                <w:rFonts w:ascii="Century Gothic" w:hAnsi="Century Gothic"/>
+                <w:lang w:val="en-US"/>
+              </w:rPr>
+              <w:t>GROUP BY a.npa</w:t>
+            </w:r>
+          </w:p>
+          <w:p>
+            <w:pPr>
+              <w:shd w:val="clear" w:color="auto" w:fill="E8E8E8" w:themeFill="background2"/>
+              <w:rPr>
+                <w:rFonts w:ascii="Century Gothic" w:hAnsi="Century Gothic"/>
+                <w:lang w:val="en-US"/>
+              </w:rPr>
+            </w:pPr>
+            <w:r>
+              <w:rPr>
+                <w:rFonts w:ascii="Century Gothic" w:hAnsi="Century Gothic"/>
+                <w:lang w:val="en-US"/>
+              </w:rPr>
+              <w:t>ORDER BY nb DESC;</w:t>
+            </w:r>
+          </w:p>
+          <w:p>
+            <w:pPr>
+              <w:rPr>
+                <w:rFonts w:ascii="Century Gothic" w:hAnsi="Century Gothic"/>
+                <w:lang w:val="en-US"/>
+              </w:rPr>
+            </w:pPr>
+          </w:p>
         </w:tc>
       </w:tr>
       <w:tr>
@@ -3002,28 +3258,445 @@
           </w:tcPr>
           <w:p>
             <w:pPr>
-              <w:pStyle w:val="Titre1"/>
-              <w:keepNext w:val="0"/>
-              <w:keepLines w:val="0"/>
-              <w:pBdr>
-                <w:top w:val="single" w:sz="4" w:space="1" w:color="auto"/>
-              </w:pBdr>
-              <w:tabs>
-                <w:tab w:val="num" w:pos="454"/>
-              </w:tabs>
-              <w:spacing w:before="240" w:after="240"/>
-              <w:ind w:firstLine="170"/>
-              <w:rPr>
-                <w:rFonts w:ascii="Century Gothic" w:hAnsi="Century Gothic"/>
-              </w:rPr>
-            </w:pPr>
+              <w:rPr>
+                <w:rFonts w:ascii="Century Gothic" w:hAnsi="Century Gothic"/>
+                <w:lang w:val="en-US"/>
+              </w:rPr>
+            </w:pPr>
+          </w:p>
+          <w:p>
+            <w:pPr>
+              <w:rPr>
+                <w:rFonts w:ascii="Century Gothic" w:hAnsi="Century Gothic"/>
+                <w:lang w:val="fr-CH"/>
+              </w:rPr>
+            </w:pPr>
+            <w:r>
+              <w:rPr>
+                <w:rFonts w:ascii="Century Gothic" w:hAnsi="Century Gothic"/>
+                <w:u w:val="single"/>
+                <w:lang w:val="fr-CH"/>
+              </w:rPr>
+              <w:lastRenderedPageBreak/>
+              <w:t>Travail à réaliser :</w:t>
+            </w:r>
+          </w:p>
+          <w:p>
+            <w:pPr>
+              <w:rPr>
+                <w:rFonts w:ascii="Century Gothic" w:hAnsi="Century Gothic"/>
+              </w:rPr>
+            </w:pPr>
+            <w:r>
+              <w:rPr>
+                <w:rFonts w:ascii="Century Gothic" w:hAnsi="Century Gothic"/>
+              </w:rPr>
+              <w:t>Vous devez créer des index pour accélérer l’exécution de ces requêtes.</w:t>
+            </w:r>
+          </w:p>
+          <w:p>
+            <w:pPr>
+              <w:rPr>
+                <w:rFonts w:ascii="Century Gothic" w:hAnsi="Century Gothic"/>
+              </w:rPr>
+            </w:pPr>
+            <w:r>
+              <w:rPr>
+                <w:rFonts w:ascii="Century Gothic" w:hAnsi="Century Gothic"/>
+              </w:rPr>
+              <w:t>Vous devez expliquer vos choix et donner les requêtes SQL permettant la création de ces index.</w:t>
+            </w:r>
+          </w:p>
+          <w:p>
+            <w:pPr>
+              <w:rPr>
+                <w:rFonts w:ascii="Century Gothic" w:hAnsi="Century Gothic"/>
+              </w:rPr>
+            </w:pPr>
+          </w:p>
+          <w:p>
+            <w:pPr>
+              <w:pStyle w:val="Titre3"/>
+            </w:pPr>
+            <w:r>
+              <w:t>Utilisateurs et rôles</w:t>
+            </w:r>
+          </w:p>
+          <w:p>
+            <w:pPr>
+              <w:rPr>
+                <w:rFonts w:ascii="Century Gothic" w:hAnsi="Century Gothic"/>
+              </w:rPr>
+            </w:pPr>
+            <w:r>
+              <w:rPr>
+                <w:rFonts w:ascii="Century Gothic" w:hAnsi="Century Gothic"/>
+              </w:rPr>
+              <w:t>Pour garantir une gestion efficace et sécurisée de la base de données de la pizzeria, tous les utilisateurs n’ont pas accès aux mêmes informations ni aux mêmes fonctionnalités. Chaque employé joue un rôle bien défini et doit uniquement pouvoir effectuer les actions nécessaires à sa fonction. L’objectif est d’éviter les erreurs, les modifications involontaires et de protéger les données sensibles.</w:t>
+            </w:r>
+          </w:p>
+          <w:p>
+            <w:pPr>
+              <w:rPr>
+                <w:rFonts w:ascii="Century Gothic" w:hAnsi="Century Gothic"/>
+              </w:rPr>
+            </w:pPr>
+          </w:p>
+          <w:p>
+            <w:pPr>
+              <w:rPr>
+                <w:rFonts w:ascii="Century Gothic" w:hAnsi="Century Gothic"/>
+              </w:rPr>
+            </w:pPr>
+            <w:r>
+              <w:rPr>
+                <w:rFonts w:ascii="Century Gothic" w:hAnsi="Century Gothic"/>
+              </w:rPr>
+              <w:t>Dans cette base de données, plusieurs types d’utilisateurs interagissent au quotidien. Voici un aperçu des différents rôles et de leurs responsabilités.</w:t>
+            </w:r>
+          </w:p>
+          <w:p>
+            <w:pPr>
+              <w:rPr>
+                <w:rFonts w:ascii="Century Gothic" w:hAnsi="Century Gothic"/>
+              </w:rPr>
+            </w:pPr>
+          </w:p>
+          <w:tbl>
+            <w:tblPr>
+              <w:tblStyle w:val="Grilledutableau"/>
+              <w:tblW w:w="0" w:type="auto"/>
+              <w:tblLook w:val="04A0" w:firstRow="1" w:lastRow="0" w:firstColumn="1" w:lastColumn="0" w:noHBand="0" w:noVBand="1"/>
+            </w:tblPr>
+            <w:tblGrid>
+              <w:gridCol w:w="2439"/>
+              <w:gridCol w:w="6407"/>
+            </w:tblGrid>
+            <w:tr>
+              <w:tc>
+                <w:tcPr>
+                  <w:tcW w:w="2439" w:type="dxa"/>
+                </w:tcPr>
+                <w:p>
+                  <w:pPr>
+                    <w:rPr>
+                      <w:rFonts w:ascii="Century Gothic" w:hAnsi="Century Gothic"/>
+                    </w:rPr>
+                  </w:pPr>
+                  <w:r>
+                    <w:rPr>
+                      <w:rFonts w:ascii="Century Gothic" w:hAnsi="Century Gothic"/>
+                    </w:rPr>
+                    <w:t>Rôle</w:t>
+                  </w:r>
+                </w:p>
+              </w:tc>
+              <w:tc>
+                <w:tcPr>
+                  <w:tcW w:w="6407" w:type="dxa"/>
+                </w:tcPr>
+                <w:p>
+                  <w:pPr>
+                    <w:rPr>
+                      <w:rFonts w:ascii="Century Gothic" w:hAnsi="Century Gothic"/>
+                    </w:rPr>
+                  </w:pPr>
+                  <w:r>
+                    <w:rPr>
+                      <w:rFonts w:ascii="Century Gothic" w:hAnsi="Century Gothic"/>
+                    </w:rPr>
+                    <w:t>Responsabilités</w:t>
+                  </w:r>
+                </w:p>
+              </w:tc>
+            </w:tr>
+            <w:tr>
+              <w:tc>
+                <w:tcPr>
+                  <w:tcW w:w="2439" w:type="dxa"/>
+                </w:tcPr>
+                <w:p>
+                  <w:pPr>
+                    <w:rPr>
+                      <w:rFonts w:ascii="Century Gothic" w:hAnsi="Century Gothic"/>
+                      <w:bCs/>
+                    </w:rPr>
+                  </w:pPr>
+                  <w:r>
+                    <w:rPr>
+                      <w:rFonts w:ascii="Century Gothic" w:hAnsi="Century Gothic"/>
+                      <w:bCs/>
+                    </w:rPr>
+                    <w:t>L'Administrateur</w:t>
+                  </w:r>
+                </w:p>
+              </w:tc>
+              <w:tc>
+                <w:tcPr>
+                  <w:tcW w:w="6407" w:type="dxa"/>
+                </w:tcPr>
+                <w:p>
+                  <w:pPr>
+                    <w:rPr>
+                      <w:rFonts w:ascii="Century Gothic" w:hAnsi="Century Gothic"/>
+                    </w:rPr>
+                  </w:pPr>
+                  <w:r>
+                    <w:rPr>
+                      <w:rFonts w:ascii="Century Gothic" w:hAnsi="Century Gothic"/>
+                    </w:rPr>
+                    <w:t>tous droits sur le schéma, gestion utilisateurs.</w:t>
+                  </w:r>
+                </w:p>
+              </w:tc>
+            </w:tr>
+            <w:tr>
+              <w:tc>
+                <w:tcPr>
+                  <w:tcW w:w="2439" w:type="dxa"/>
+                </w:tcPr>
+                <w:p>
+                  <w:pPr>
+                    <w:rPr>
+                      <w:rFonts w:ascii="Century Gothic" w:hAnsi="Century Gothic"/>
+                    </w:rPr>
+                  </w:pPr>
+                  <w:r>
+                    <w:rPr>
+                      <w:rFonts w:ascii="Century Gothic" w:hAnsi="Century Gothic"/>
+                    </w:rPr>
+                    <w:t>Manager</w:t>
+                  </w:r>
+                </w:p>
+              </w:tc>
+              <w:tc>
+                <w:tcPr>
+                  <w:tcW w:w="6407" w:type="dxa"/>
+                </w:tcPr>
+                <w:p>
+                  <w:pPr>
+                    <w:rPr>
+                      <w:rFonts w:ascii="Century Gothic" w:hAnsi="Century Gothic"/>
+                    </w:rPr>
+                  </w:pPr>
+                  <w:r>
+                    <w:rPr>
+                      <w:rFonts w:ascii="Century Gothic" w:hAnsi="Century Gothic"/>
+                    </w:rPr>
+                    <w:t>créer/fermer commandes, gérer livraisons, voir paiements, gérer catalogue.</w:t>
+                  </w:r>
+                </w:p>
+              </w:tc>
+            </w:tr>
+            <w:tr>
+              <w:tc>
+                <w:tcPr>
+                  <w:tcW w:w="2439" w:type="dxa"/>
+                </w:tcPr>
+                <w:p>
+                  <w:pPr>
+                    <w:rPr>
+                      <w:rFonts w:ascii="Century Gothic" w:hAnsi="Century Gothic"/>
+                    </w:rPr>
+                  </w:pPr>
+                  <w:r>
+                    <w:rPr>
+                      <w:rFonts w:ascii="Century Gothic" w:hAnsi="Century Gothic"/>
+                    </w:rPr>
+                    <w:t>Pizzaiolo</w:t>
+                  </w:r>
+                </w:p>
+              </w:tc>
+              <w:tc>
+                <w:tcPr>
+                  <w:tcW w:w="6407" w:type="dxa"/>
+                </w:tcPr>
+                <w:p>
+                  <w:pPr>
+                    <w:rPr>
+                      <w:rFonts w:ascii="Century Gothic" w:hAnsi="Century Gothic"/>
+                    </w:rPr>
+                  </w:pPr>
+                  <w:r>
+                    <w:rPr>
+                      <w:rFonts w:ascii="Century Gothic" w:hAnsi="Century Gothic"/>
+                    </w:rPr>
+                    <w:t>lecture commandes en préparation, mise à jour statut préparation, (optionnel) saisie consommation ingrédients.</w:t>
+                  </w:r>
+                </w:p>
+              </w:tc>
+            </w:tr>
+            <w:tr>
+              <w:tc>
+                <w:tcPr>
+                  <w:tcW w:w="2439" w:type="dxa"/>
+                </w:tcPr>
+                <w:p>
+                  <w:pPr>
+                    <w:rPr>
+                      <w:rFonts w:ascii="Century Gothic" w:hAnsi="Century Gothic"/>
+                    </w:rPr>
+                  </w:pPr>
+                  <w:r>
+                    <w:rPr>
+                      <w:rFonts w:ascii="Century Gothic" w:hAnsi="Century Gothic"/>
+                    </w:rPr>
+                    <w:t>Livreur</w:t>
+                  </w:r>
+                </w:p>
+              </w:tc>
+              <w:tc>
+                <w:tcPr>
+                  <w:tcW w:w="6407" w:type="dxa"/>
+                </w:tcPr>
+                <w:p>
+                  <w:pPr>
+                    <w:rPr>
+                      <w:rFonts w:ascii="Century Gothic" w:hAnsi="Century Gothic"/>
+                    </w:rPr>
+                  </w:pPr>
+                  <w:r>
+                    <w:rPr>
+                      <w:rFonts w:ascii="Century Gothic" w:hAnsi="Century Gothic"/>
+                    </w:rPr>
+                    <w:t>lecture commandes assignées, mise à jour statut livraison (en_livraison → livrée).</w:t>
+                  </w:r>
+                </w:p>
+              </w:tc>
+            </w:tr>
+            <w:tr>
+              <w:tc>
+                <w:tcPr>
+                  <w:tcW w:w="2439" w:type="dxa"/>
+                </w:tcPr>
+                <w:p>
+                  <w:pPr>
+                    <w:rPr>
+                      <w:rFonts w:ascii="Century Gothic" w:hAnsi="Century Gothic"/>
+                    </w:rPr>
+                  </w:pPr>
+                  <w:r>
+                    <w:rPr>
+                      <w:rFonts w:ascii="Century Gothic" w:hAnsi="Century Gothic"/>
+                    </w:rPr>
+                    <w:t>Agent de caisse</w:t>
+                  </w:r>
+                </w:p>
+              </w:tc>
+              <w:tc>
+                <w:tcPr>
+                  <w:tcW w:w="6407" w:type="dxa"/>
+                </w:tcPr>
+                <w:p>
+                  <w:pPr>
+                    <w:rPr>
+                      <w:rFonts w:ascii="Century Gothic" w:hAnsi="Century Gothic"/>
+                    </w:rPr>
+                  </w:pPr>
+                  <w:r>
+                    <w:rPr>
+                      <w:rFonts w:ascii="Century Gothic" w:hAnsi="Century Gothic"/>
+                    </w:rPr>
+                    <w:t>créer paiements, rembourser (partiel), voir commandes.</w:t>
+                  </w:r>
+                </w:p>
+              </w:tc>
+            </w:tr>
+            <w:tr>
+              <w:tc>
+                <w:tcPr>
+                  <w:tcW w:w="2439" w:type="dxa"/>
+                </w:tcPr>
+                <w:p>
+                  <w:pPr>
+                    <w:rPr>
+                      <w:rFonts w:ascii="Century Gothic" w:hAnsi="Century Gothic"/>
+                    </w:rPr>
+                  </w:pPr>
+                  <w:r>
+                    <w:rPr>
+                      <w:rFonts w:ascii="Century Gothic" w:hAnsi="Century Gothic"/>
+                    </w:rPr>
+                    <w:t>Analyste</w:t>
+                  </w:r>
+                </w:p>
+              </w:tc>
+              <w:tc>
+                <w:tcPr>
+                  <w:tcW w:w="6407" w:type="dxa"/>
+                </w:tcPr>
+                <w:p>
+                  <w:pPr>
+                    <w:rPr>
+                      <w:rFonts w:ascii="Century Gothic" w:hAnsi="Century Gothic"/>
+                    </w:rPr>
+                  </w:pPr>
+                  <w:r>
+                    <w:rPr>
+                      <w:rFonts w:ascii="Century Gothic" w:hAnsi="Century Gothic"/>
+                    </w:rPr>
+                    <w:t>lecture seule (SELECT sur tout).</w:t>
+                  </w:r>
+                </w:p>
+              </w:tc>
+            </w:tr>
+          </w:tbl>
+          <w:p>
+            <w:pPr>
+              <w:rPr>
+                <w:rFonts w:ascii="Century Gothic" w:hAnsi="Century Gothic"/>
+              </w:rPr>
+            </w:pPr>
+          </w:p>
+          <w:p>
+            <w:pPr>
+              <w:rPr>
+                <w:rFonts w:ascii="Century Gothic" w:hAnsi="Century Gothic"/>
+                <w:bCs/>
+                <w:u w:val="single"/>
+              </w:rPr>
+            </w:pPr>
+            <w:r>
+              <w:rPr>
+                <w:rFonts w:ascii="Century Gothic" w:hAnsi="Century Gothic"/>
+                <w:bCs/>
+                <w:u w:val="single"/>
+              </w:rPr>
+              <w:t>Travail à réaliser</w:t>
+            </w:r>
+          </w:p>
+          <w:p>
+            <w:pPr>
+              <w:rPr>
+                <w:rFonts w:ascii="Century Gothic" w:hAnsi="Century Gothic"/>
+              </w:rPr>
+            </w:pPr>
+            <w:r>
+              <w:rPr>
+                <w:rFonts w:ascii="Century Gothic" w:hAnsi="Century Gothic"/>
+              </w:rPr>
+              <w:t>Dans cette section, vous devez créer les rôles avec les bons privilèges.</w:t>
+            </w:r>
+          </w:p>
+          <w:p>
+            <w:pPr>
+              <w:rPr>
+                <w:rFonts w:ascii="Century Gothic" w:hAnsi="Century Gothic"/>
+              </w:rPr>
+            </w:pPr>
+            <w:r>
+              <w:rPr>
+                <w:rFonts w:ascii="Century Gothic" w:hAnsi="Century Gothic"/>
+              </w:rPr>
+              <w:t>Vous devez également créer au moins un utilisateur par rôle</w:t>
+            </w:r>
           </w:p>
         </w:tc>
       </w:tr>
     </w:tbl>
     <w:p/>
     <w:sectPr>
-      <w:headerReference w:type="default" r:id="rId7"/>
+      <w:headerReference w:type="default" r:id="rId10"/>
       <w:pgSz w:w="11906" w:h="16838"/>
       <w:pgMar w:top="1417" w:right="1417" w:bottom="1417" w:left="1417" w:header="708" w:footer="708" w:gutter="0"/>
       <w:cols w:space="708"/>
@@ -4181,6 +4854,95 @@
     </w:lvl>
   </w:abstractNum>
   <w:abstractNum w:abstractNumId="8" w15:restartNumberingAfterBreak="0">
+    <w:nsid w:val="62E36BA8"/>
+    <w:multiLevelType w:val="hybridMultilevel"/>
+    <w:tmpl w:val="DA6AACA2"/>
+    <w:lvl w:ilvl="0" w:tplc="6172D592">
+      <w:start w:val="5"/>
+      <w:numFmt w:val="decimal"/>
+      <w:lvlText w:val="%1."/>
+      <w:lvlJc w:val="left"/>
+      <w:pPr>
+        <w:ind w:left="720" w:hanging="360"/>
+      </w:pPr>
+      <w:rPr>
+        <w:rFonts w:hint="default"/>
+      </w:rPr>
+    </w:lvl>
+    <w:lvl w:ilvl="1" w:tplc="100C0019" w:tentative="1">
+      <w:start w:val="1"/>
+      <w:numFmt w:val="lowerLetter"/>
+      <w:lvlText w:val="%2."/>
+      <w:lvlJc w:val="left"/>
+      <w:pPr>
+        <w:ind w:left="1440" w:hanging="360"/>
+      </w:pPr>
+    </w:lvl>
+    <w:lvl w:ilvl="2" w:tplc="100C001B" w:tentative="1">
+      <w:start w:val="1"/>
+      <w:numFmt w:val="lowerRoman"/>
+      <w:lvlText w:val="%3."/>
+      <w:lvlJc w:val="right"/>
+      <w:pPr>
+        <w:ind w:left="2160" w:hanging="180"/>
+      </w:pPr>
+    </w:lvl>
+    <w:lvl w:ilvl="3" w:tplc="100C000F" w:tentative="1">
+      <w:start w:val="1"/>
+      <w:numFmt w:val="decimal"/>
+      <w:lvlText w:val="%4."/>
+      <w:lvlJc w:val="left"/>
+      <w:pPr>
+        <w:ind w:left="2880" w:hanging="360"/>
+      </w:pPr>
+    </w:lvl>
+    <w:lvl w:ilvl="4" w:tplc="100C0019" w:tentative="1">
+      <w:start w:val="1"/>
+      <w:numFmt w:val="lowerLetter"/>
+      <w:lvlText w:val="%5."/>
+      <w:lvlJc w:val="left"/>
+      <w:pPr>
+        <w:ind w:left="3600" w:hanging="360"/>
+      </w:pPr>
+    </w:lvl>
+    <w:lvl w:ilvl="5" w:tplc="100C001B" w:tentative="1">
+      <w:start w:val="1"/>
+      <w:numFmt w:val="lowerRoman"/>
+      <w:lvlText w:val="%6."/>
+      <w:lvlJc w:val="right"/>
+      <w:pPr>
+        <w:ind w:left="4320" w:hanging="180"/>
+      </w:pPr>
+    </w:lvl>
+    <w:lvl w:ilvl="6" w:tplc="100C000F" w:tentative="1">
+      <w:start w:val="1"/>
+      <w:numFmt w:val="decimal"/>
+      <w:lvlText w:val="%7."/>
+      <w:lvlJc w:val="left"/>
+      <w:pPr>
+        <w:ind w:left="5040" w:hanging="360"/>
+      </w:pPr>
+    </w:lvl>
+    <w:lvl w:ilvl="7" w:tplc="100C0019" w:tentative="1">
+      <w:start w:val="1"/>
+      <w:numFmt w:val="lowerLetter"/>
+      <w:lvlText w:val="%8."/>
+      <w:lvlJc w:val="left"/>
+      <w:pPr>
+        <w:ind w:left="5760" w:hanging="360"/>
+      </w:pPr>
+    </w:lvl>
+    <w:lvl w:ilvl="8" w:tplc="100C001B" w:tentative="1">
+      <w:start w:val="1"/>
+      <w:numFmt w:val="lowerRoman"/>
+      <w:lvlText w:val="%9."/>
+      <w:lvlJc w:val="right"/>
+      <w:pPr>
+        <w:ind w:left="6480" w:hanging="180"/>
+      </w:pPr>
+    </w:lvl>
+  </w:abstractNum>
+  <w:abstractNum w:abstractNumId="9" w15:restartNumberingAfterBreak="0">
     <w:nsid w:val="67A0443E"/>
     <w:multiLevelType w:val="hybridMultilevel"/>
     <w:tmpl w:val="95C4EA28"/>
@@ -4303,7 +5065,7 @@
     <w:abstractNumId w:val="2"/>
   </w:num>
   <w:num w:numId="4" w16cid:durableId="1352025238">
-    <w:abstractNumId w:val="8"/>
+    <w:abstractNumId w:val="9"/>
   </w:num>
   <w:num w:numId="5" w16cid:durableId="1910537461">
     <w:abstractNumId w:val="3"/>
@@ -4322,6 +5084,9 @@
   </w:num>
   <w:num w:numId="10" w16cid:durableId="1950159856">
     <w:abstractNumId w:val="1"/>
+  </w:num>
+  <w:num w:numId="11" w16cid:durableId="1760439864">
+    <w:abstractNumId w:val="8"/>
   </w:num>
 </w:numbering>
 </file>
@@ -5368,6 +6133,25 @@
       <w:bCs/>
     </w:rPr>
   </w:style>
+  <w:style w:type="table" w:styleId="Grilledutableau">
+    <w:name w:val="Table Grid"/>
+    <w:basedOn w:val="TableauNormal"/>
+    <w:uiPriority w:val="39"/>
+    <w:rsid w:val="00676EC9"/>
+    <w:pPr>
+      <w:spacing w:after="0" w:line="240" w:lineRule="auto"/>
+    </w:pPr>
+    <w:tblPr>
+      <w:tblBorders>
+        <w:top w:val="single" w:sz="4" w:space="0" w:color="auto"/>
+        <w:left w:val="single" w:sz="4" w:space="0" w:color="auto"/>
+        <w:bottom w:val="single" w:sz="4" w:space="0" w:color="auto"/>
+        <w:right w:val="single" w:sz="4" w:space="0" w:color="auto"/>
+        <w:insideH w:val="single" w:sz="4" w:space="0" w:color="auto"/>
+        <w:insideV w:val="single" w:sz="4" w:space="0" w:color="auto"/>
+      </w:tblBorders>
+    </w:tblPr>
+  </w:style>
 </w:styles>
 </file>
 
@@ -5667,8 +6451,28 @@
 </file>
 
 <file path=customXml/item1.xml><?xml version="1.0" encoding="utf-8"?>
-<ct:contentTypeSchema xmlns:ct="http://schemas.microsoft.com/office/2006/metadata/contentType" xmlns:ma="http://schemas.microsoft.com/office/2006/metadata/properties/metaAttributes" ct:_="" ma:_="" ma:contentTypeName="Document" ma:contentTypeID="0x0101005B1120F001D1794FAA6F4057E3355991" ma:contentTypeVersion="10" ma:contentTypeDescription="Crée un document." ma:contentTypeScope="" ma:versionID="a3fb6df6b31548c4fd074caa2ed14580">
-  <xsd:schema xmlns:xsd="http://www.w3.org/2001/XMLSchema" xmlns:xs="http://www.w3.org/2001/XMLSchema" xmlns:p="http://schemas.microsoft.com/office/2006/metadata/properties" xmlns:ns2="f20a0681-8b2f-4a46-9dab-cf1520193f81" xmlns:ns3="932fafb7-d8e0-4a14-bee3-33aad5c71309" targetNamespace="http://schemas.microsoft.com/office/2006/metadata/properties" ma:root="true" ma:fieldsID="3d4691fe5d3e52a7f10faf36b21998c3" ns2:_="" ns3:_="">
+<p:properties xmlns:p="http://schemas.microsoft.com/office/2006/metadata/properties" xmlns:xsi="http://www.w3.org/2001/XMLSchema-instance" xmlns:pc="http://schemas.microsoft.com/office/infopath/2007/PartnerControls">
+  <documentManagement>
+    <lcf76f155ced4ddcb4097134ff3c332f xmlns="f20a0681-8b2f-4a46-9dab-cf1520193f81">
+      <Terms xmlns="http://schemas.microsoft.com/office/infopath/2007/PartnerControls"/>
+    </lcf76f155ced4ddcb4097134ff3c332f>
+    <TaxCatchAll xmlns="932fafb7-d8e0-4a14-bee3-33aad5c71309" xsi:nil="true"/>
+  </documentManagement>
+</p:properties>
+</file>
+
+<file path=customXml/item2.xml><?xml version="1.0" encoding="utf-8"?>
+<?mso-contentType ?>
+<FormTemplates xmlns="http://schemas.microsoft.com/sharepoint/v3/contenttype/forms">
+  <Display>DocumentLibraryForm</Display>
+  <Edit>DocumentLibraryForm</Edit>
+  <New>DocumentLibraryForm</New>
+</FormTemplates>
+</file>
+
+<file path=customXml/item3.xml><?xml version="1.0" encoding="utf-8"?>
+<ct:contentTypeSchema xmlns:ct="http://schemas.microsoft.com/office/2006/metadata/contentType" xmlns:ma="http://schemas.microsoft.com/office/2006/metadata/properties/metaAttributes" ct:_="" ma:_="" ma:contentTypeName="Document" ma:contentTypeID="0x0101005B1120F001D1794FAA6F4057E3355991" ma:contentTypeVersion="10" ma:contentTypeDescription="Crée un document." ma:contentTypeScope="" ma:versionID="b4a5ad45c54fa8cfccf4b5a6490850dd">
+  <xsd:schema xmlns:xsd="http://www.w3.org/2001/XMLSchema" xmlns:xs="http://www.w3.org/2001/XMLSchema" xmlns:p="http://schemas.microsoft.com/office/2006/metadata/properties" xmlns:ns2="f20a0681-8b2f-4a46-9dab-cf1520193f81" xmlns:ns3="932fafb7-d8e0-4a14-bee3-33aad5c71309" targetNamespace="http://schemas.microsoft.com/office/2006/metadata/properties" ma:root="true" ma:fieldsID="fe3b3ea8edd81a9012b97c6ddf640adc" ns2:_="" ns3:_="">
     <xsd:import namespace="f20a0681-8b2f-4a46-9dab-cf1520193f81"/>
     <xsd:import namespace="932fafb7-d8e0-4a14-bee3-33aad5c71309"/>
     <xsd:element name="properties">
@@ -5855,34 +6659,25 @@
 </ct:contentTypeSchema>
 </file>
 
-<file path=customXml/item2.xml><?xml version="1.0" encoding="utf-8"?>
-<?mso-contentType ?>
-<FormTemplates xmlns="http://schemas.microsoft.com/sharepoint/v3/contenttype/forms">
-  <Display>DocumentLibraryForm</Display>
-  <Edit>DocumentLibraryForm</Edit>
-  <New>DocumentLibraryForm</New>
-</FormTemplates>
-</file>
-
-<file path=customXml/item3.xml><?xml version="1.0" encoding="utf-8"?>
-<p:properties xmlns:p="http://schemas.microsoft.com/office/2006/metadata/properties" xmlns:xsi="http://www.w3.org/2001/XMLSchema-instance" xmlns:pc="http://schemas.microsoft.com/office/infopath/2007/PartnerControls">
-  <documentManagement>
-    <lcf76f155ced4ddcb4097134ff3c332f xmlns="f20a0681-8b2f-4a46-9dab-cf1520193f81">
-      <Terms xmlns="http://schemas.microsoft.com/office/infopath/2007/PartnerControls"/>
-    </lcf76f155ced4ddcb4097134ff3c332f>
-    <TaxCatchAll xmlns="932fafb7-d8e0-4a14-bee3-33aad5c71309" xsi:nil="true"/>
-  </documentManagement>
-</p:properties>
-</file>
-
 <file path=customXml/itemProps1.xml><?xml version="1.0" encoding="utf-8"?>
-<ds:datastoreItem xmlns:ds="http://schemas.openxmlformats.org/officeDocument/2006/customXml" ds:itemID="{4E93FF16-8FA0-4E8B-B434-3B41E6BCD694}"/>
+<ds:datastoreItem xmlns:ds="http://schemas.openxmlformats.org/officeDocument/2006/customXml" ds:itemID="{D998B7D1-CA50-49F7-935B-88C3B5106ED3}">
+  <ds:schemaRefs>
+    <ds:schemaRef ds:uri="http://schemas.microsoft.com/office/2006/metadata/properties"/>
+    <ds:schemaRef ds:uri="http://schemas.microsoft.com/office/infopath/2007/PartnerControls"/>
+    <ds:schemaRef ds:uri="f20a0681-8b2f-4a46-9dab-cf1520193f81"/>
+    <ds:schemaRef ds:uri="932fafb7-d8e0-4a14-bee3-33aad5c71309"/>
+  </ds:schemaRefs>
+</ds:datastoreItem>
 </file>
 
 <file path=customXml/itemProps2.xml><?xml version="1.0" encoding="utf-8"?>
-<ds:datastoreItem xmlns:ds="http://schemas.openxmlformats.org/officeDocument/2006/customXml" ds:itemID="{799B55CB-6D74-4C8E-B4FC-96A661915CCD}"/>
+<ds:datastoreItem xmlns:ds="http://schemas.openxmlformats.org/officeDocument/2006/customXml" ds:itemID="{799B55CB-6D74-4C8E-B4FC-96A661915CCD}">
+  <ds:schemaRefs>
+    <ds:schemaRef ds:uri="http://schemas.microsoft.com/sharepoint/v3/contenttype/forms"/>
+  </ds:schemaRefs>
+</ds:datastoreItem>
 </file>
 
 <file path=customXml/itemProps3.xml><?xml version="1.0" encoding="utf-8"?>
-<ds:datastoreItem xmlns:ds="http://schemas.openxmlformats.org/officeDocument/2006/customXml" ds:itemID="{D998B7D1-CA50-49F7-935B-88C3B5106ED3}"/>
+<ds:datastoreItem xmlns:ds="http://schemas.openxmlformats.org/officeDocument/2006/customXml" ds:itemID="{D2D8D934-3720-4F68-AC3B-3C085B7399B0}"/>
 </file>
</xml_diff>

<commit_message>
chore(CdC) : revoir coquille
Modification d'un partie de la 2e requête du chapitre index. Il s'y trouvait une coquille
</commit_message>
<xml_diff>
--- a/P_DB106_GRP2C.docx
+++ b/P_DB106_GRP2C.docx
@@ -1,6 +1,6 @@
 
 <file path=word/document.xml><?xml version="1.0" encoding="utf-8"?>
-<w:document xmlns:wpc="http://schemas.microsoft.com/office/word/2010/wordprocessingCanvas" xmlns:cx="http://schemas.microsoft.com/office/drawing/2014/chartex" xmlns:cx1="http://schemas.microsoft.com/office/drawing/2015/9/8/chartex" xmlns:cx2="http://schemas.microsoft.com/office/drawing/2015/10/21/chartex" xmlns:cx3="http://schemas.microsoft.com/office/drawing/2016/5/9/chartex" xmlns:cx4="http://schemas.microsoft.com/office/drawing/2016/5/10/chartex" xmlns:cx5="http://schemas.microsoft.com/office/drawing/2016/5/11/chartex" xmlns:cx6="http://schemas.microsoft.com/office/drawing/2016/5/12/chartex" xmlns:cx7="http://schemas.microsoft.com/office/drawing/2016/5/13/chartex" xmlns:cx8="http://schemas.microsoft.com/office/drawing/2016/5/14/chartex" xmlns:mc="http://schemas.openxmlformats.org/markup-compatibility/2006" xmlns:aink="http://schemas.microsoft.com/office/drawing/2016/ink" xmlns:am3d="http://schemas.microsoft.com/office/drawing/2017/model3d" xmlns:o="urn:schemas-microsoft-com:office:office" xmlns:oel="http://schemas.microsoft.com/office/2019/extlst" xmlns:r="http://schemas.openxmlformats.org/officeDocument/2006/relationships" xmlns:m="http://schemas.openxmlformats.org/officeDocument/2006/math" xmlns:v="urn:schemas-microsoft-com:vml" xmlns:wp14="http://schemas.microsoft.com/office/word/2010/wordprocessingDrawing" xmlns:wp="http://schemas.openxmlformats.org/drawingml/2006/wordprocessingDrawing" xmlns:w10="urn:schemas-microsoft-com:office:word" xmlns:w="http://schemas.openxmlformats.org/wordprocessingml/2006/main" xmlns:w14="http://schemas.microsoft.com/office/word/2010/wordml" xmlns:w15="http://schemas.microsoft.com/office/word/2012/wordml" xmlns:w16cex="http://schemas.microsoft.com/office/word/2018/wordml/cex" xmlns:w16cid="http://schemas.microsoft.com/office/word/2016/wordml/cid" xmlns:w16="http://schemas.microsoft.com/office/word/2018/wordml" xmlns:w16du="http://schemas.microsoft.com/office/word/2023/wordml/word16du" xmlns:w16sdtdh="http://schemas.microsoft.com/office/word/2020/wordml/sdtdatahash" xmlns:w16sdtfl="http://schemas.microsoft.com/office/word/2024/wordml/sdtformatlock" xmlns:w16se="http://schemas.microsoft.com/office/word/2015/wordml/symex" xmlns:wpg="http://schemas.microsoft.com/office/word/2010/wordprocessingGroup" xmlns:wpi="http://schemas.microsoft.com/office/word/2010/wordprocessingInk" xmlns:wne="http://schemas.microsoft.com/office/word/2006/wordml" xmlns:wps="http://schemas.microsoft.com/office/word/2010/wordprocessingShape" mc:Ignorable="w14 w15 w16se w16cid w16 w16cex w16sdtdh w16sdtfl w16du wp14">
+<w:document xmlns:wpc="http://schemas.microsoft.com/office/word/2010/wordprocessingCanvas" xmlns:cx="http://schemas.microsoft.com/office/drawing/2014/chartex" xmlns:cx1="http://schemas.microsoft.com/office/drawing/2015/9/8/chartex" xmlns:cx2="http://schemas.microsoft.com/office/drawing/2015/10/21/chartex" xmlns:cx3="http://schemas.microsoft.com/office/drawing/2016/5/9/chartex" xmlns:cx4="http://schemas.microsoft.com/office/drawing/2016/5/10/chartex" xmlns:cx5="http://schemas.microsoft.com/office/drawing/2016/5/11/chartex" xmlns:cx6="http://schemas.microsoft.com/office/drawing/2016/5/12/chartex" xmlns:cx7="http://schemas.microsoft.com/office/drawing/2016/5/13/chartex" xmlns:cx8="http://schemas.microsoft.com/office/drawing/2016/5/14/chartex" xmlns:mc="http://schemas.openxmlformats.org/markup-compatibility/2006" xmlns:aink="http://schemas.microsoft.com/office/drawing/2016/ink" xmlns:am3d="http://schemas.microsoft.com/office/drawing/2017/model3d" xmlns:o="urn:schemas-microsoft-com:office:office" xmlns:oel="http://schemas.microsoft.com/office/2019/extlst" xmlns:r="http://schemas.openxmlformats.org/officeDocument/2006/relationships" xmlns:m="http://schemas.openxmlformats.org/officeDocument/2006/math" xmlns:v="urn:schemas-microsoft-com:vml" xmlns:wp14="http://schemas.microsoft.com/office/word/2010/wordprocessingDrawing" xmlns:wp="http://schemas.openxmlformats.org/drawingml/2006/wordprocessingDrawing" xmlns:w10="urn:schemas-microsoft-com:office:word" xmlns:w="http://schemas.openxmlformats.org/wordprocessingml/2006/main" xmlns:w14="http://schemas.microsoft.com/office/word/2010/wordml" xmlns:w15="http://schemas.microsoft.com/office/word/2012/wordml" xmlns:w16cex="http://schemas.microsoft.com/office/word/2018/wordml/cex" xmlns:w16cid="http://schemas.microsoft.com/office/word/2016/wordml/cid" xmlns:w16="http://schemas.microsoft.com/office/word/2018/wordml" xmlns:w16sdtdh="http://schemas.microsoft.com/office/word/2020/wordml/sdtdatahash" xmlns:w16se="http://schemas.microsoft.com/office/word/2015/wordml/symex" xmlns:wpg="http://schemas.microsoft.com/office/word/2010/wordprocessingGroup" xmlns:wpi="http://schemas.microsoft.com/office/word/2010/wordprocessingInk" xmlns:wne="http://schemas.microsoft.com/office/word/2006/wordml" xmlns:wps="http://schemas.microsoft.com/office/word/2010/wordprocessingShape" mc:Ignorable="w14 w15 w16se w16cid w16 w16cex w16sdtdh wp14">
   <w:body>
     <w:p>
       <w:pPr>
@@ -941,11 +941,19 @@
                 <w:rFonts w:ascii="Century Gothic" w:hAnsi="Century Gothic"/>
               </w:rPr>
             </w:pPr>
-            <w:r>
-              <w:rPr>
-                <w:rFonts w:ascii="Century Gothic" w:hAnsi="Century Gothic"/>
-              </w:rPr>
-              <w:t>les clients et leurs adresses,</w:t>
+            <w:proofErr w:type="gramStart"/>
+            <w:r>
+              <w:rPr>
+                <w:rFonts w:ascii="Century Gothic" w:hAnsi="Century Gothic"/>
+              </w:rPr>
+              <w:t>les</w:t>
+            </w:r>
+            <w:proofErr w:type="gramEnd"/>
+            <w:r>
+              <w:rPr>
+                <w:rFonts w:ascii="Century Gothic" w:hAnsi="Century Gothic"/>
+              </w:rPr>
+              <w:t xml:space="preserve"> clients et leurs adresses,</w:t>
             </w:r>
           </w:p>
           <w:p>
@@ -959,11 +967,19 @@
                 <w:rFonts w:ascii="Century Gothic" w:hAnsi="Century Gothic"/>
               </w:rPr>
             </w:pPr>
-            <w:r>
-              <w:rPr>
-                <w:rFonts w:ascii="Century Gothic" w:hAnsi="Century Gothic"/>
-              </w:rPr>
-              <w:t>les produits (pizzas, toppings, boissons, desserts),</w:t>
+            <w:proofErr w:type="gramStart"/>
+            <w:r>
+              <w:rPr>
+                <w:rFonts w:ascii="Century Gothic" w:hAnsi="Century Gothic"/>
+              </w:rPr>
+              <w:t>les</w:t>
+            </w:r>
+            <w:proofErr w:type="gramEnd"/>
+            <w:r>
+              <w:rPr>
+                <w:rFonts w:ascii="Century Gothic" w:hAnsi="Century Gothic"/>
+              </w:rPr>
+              <w:t xml:space="preserve"> produits (pizzas, toppings, boissons, desserts),</w:t>
             </w:r>
           </w:p>
           <w:p>
@@ -977,11 +993,19 @@
                 <w:rFonts w:ascii="Century Gothic" w:hAnsi="Century Gothic"/>
               </w:rPr>
             </w:pPr>
-            <w:r>
-              <w:rPr>
-                <w:rFonts w:ascii="Century Gothic" w:hAnsi="Century Gothic"/>
-              </w:rPr>
-              <w:t>les commandes, lignes de commande et paiements,</w:t>
+            <w:proofErr w:type="gramStart"/>
+            <w:r>
+              <w:rPr>
+                <w:rFonts w:ascii="Century Gothic" w:hAnsi="Century Gothic"/>
+              </w:rPr>
+              <w:t>les</w:t>
+            </w:r>
+            <w:proofErr w:type="gramEnd"/>
+            <w:r>
+              <w:rPr>
+                <w:rFonts w:ascii="Century Gothic" w:hAnsi="Century Gothic"/>
+              </w:rPr>
+              <w:t xml:space="preserve"> commandes, lignes de commande et paiements,</w:t>
             </w:r>
           </w:p>
           <w:p>
@@ -995,11 +1019,19 @@
                 <w:rFonts w:ascii="Century Gothic" w:hAnsi="Century Gothic"/>
               </w:rPr>
             </w:pPr>
-            <w:r>
-              <w:rPr>
-                <w:rFonts w:ascii="Century Gothic" w:hAnsi="Century Gothic"/>
-              </w:rPr>
-              <w:t xml:space="preserve">les livreurs, </w:t>
+            <w:proofErr w:type="gramStart"/>
+            <w:r>
+              <w:rPr>
+                <w:rFonts w:ascii="Century Gothic" w:hAnsi="Century Gothic"/>
+              </w:rPr>
+              <w:t>les</w:t>
+            </w:r>
+            <w:proofErr w:type="gramEnd"/>
+            <w:r>
+              <w:rPr>
+                <w:rFonts w:ascii="Century Gothic" w:hAnsi="Century Gothic"/>
+              </w:rPr>
+              <w:t xml:space="preserve"> livreurs, </w:t>
             </w:r>
             <w:r>
               <w:rPr>
@@ -1278,7 +1310,21 @@
               <w:rPr>
                 <w:rFonts w:ascii="Century Gothic" w:hAnsi="Century Gothic"/>
               </w:rPr>
-              <w:t>Une commande a 1..n paiements (acomptes possibles). Suivi du montant payé / reste.</w:t>
+              <w:t xml:space="preserve">Une commande a </w:t>
+            </w:r>
+            <w:proofErr w:type="gramStart"/>
+            <w:r>
+              <w:rPr>
+                <w:rFonts w:ascii="Century Gothic" w:hAnsi="Century Gothic"/>
+              </w:rPr>
+              <w:t>1..</w:t>
+            </w:r>
+            <w:proofErr w:type="gramEnd"/>
+            <w:r>
+              <w:rPr>
+                <w:rFonts w:ascii="Century Gothic" w:hAnsi="Century Gothic"/>
+              </w:rPr>
+              <w:t>n paiements (acomptes possibles). Suivi du montant payé / reste.</w:t>
             </w:r>
           </w:p>
           <w:p>
@@ -2508,7 +2554,21 @@
               <w:rPr>
                 <w:rFonts w:ascii="Century Gothic" w:hAnsi="Century Gothic"/>
               </w:rPr>
-              <w:t>nombre de commandes par heure. Il s’agit par cette requêtes de savoir quelles sont les heures « chaudes ».</w:t>
+              <w:t xml:space="preserve">nombre de commandes par heure. Il s’agit par </w:t>
+            </w:r>
+            <w:proofErr w:type="gramStart"/>
+            <w:r>
+              <w:rPr>
+                <w:rFonts w:ascii="Century Gothic" w:hAnsi="Century Gothic"/>
+              </w:rPr>
+              <w:t>cette requêtes</w:t>
+            </w:r>
+            <w:proofErr w:type="gramEnd"/>
+            <w:r>
+              <w:rPr>
+                <w:rFonts w:ascii="Century Gothic" w:hAnsi="Century Gothic"/>
+              </w:rPr>
+              <w:t xml:space="preserve"> de savoir quelles sont les heures « chaudes ».</w:t>
             </w:r>
           </w:p>
           <w:p>
@@ -3100,7 +3160,23 @@
                 <w:rFonts w:ascii="Century Gothic" w:hAnsi="Century Gothic"/>
                 <w:lang w:val="en-US"/>
               </w:rPr>
-              <w:t>WHERE c.statut = 'en_livraison' AND c.date_creation &gt; '2025-01-01'</w:t>
+              <w:t xml:space="preserve">WHERE </w:t>
+            </w:r>
+            <w:proofErr w:type="gramStart"/>
+            <w:r>
+              <w:rPr>
+                <w:rFonts w:ascii="Century Gothic" w:hAnsi="Century Gothic"/>
+                <w:lang w:val="en-US"/>
+              </w:rPr>
+              <w:t>c.statut</w:t>
+            </w:r>
+            <w:proofErr w:type="gramEnd"/>
+            <w:r>
+              <w:rPr>
+                <w:rFonts w:ascii="Century Gothic" w:hAnsi="Century Gothic"/>
+                <w:lang w:val="en-US"/>
+              </w:rPr>
+              <w:t xml:space="preserve"> = 'en_livraison' AND c.date_creation &gt; '2025-01-01'</w:t>
             </w:r>
           </w:p>
           <w:p>
@@ -3116,22 +3192,23 @@
                 <w:rFonts w:ascii="Century Gothic" w:hAnsi="Century Gothic"/>
                 <w:lang w:val="en-US"/>
               </w:rPr>
-              <w:t>ORDER BY c.date_creation DESC;</w:t>
-            </w:r>
-          </w:p>
-          <w:p>
-            <w:pPr>
+              <w:t xml:space="preserve">ORDER BY </w:t>
+            </w:r>
+            <w:proofErr w:type="gramStart"/>
+            <w:r>
               <w:rPr>
                 <w:rFonts w:ascii="Century Gothic" w:hAnsi="Century Gothic"/>
                 <w:lang w:val="en-US"/>
               </w:rPr>
-            </w:pPr>
+              <w:t>c.date</w:t>
+            </w:r>
+            <w:proofErr w:type="gramEnd"/>
             <w:r>
               <w:rPr>
                 <w:rFonts w:ascii="Century Gothic" w:hAnsi="Century Gothic"/>
                 <w:lang w:val="en-US"/>
               </w:rPr>
-              <w:t>Requête n°2 :</w:t>
+              <w:t>_creation DESC;</w:t>
             </w:r>
           </w:p>
           <w:p>
@@ -3141,6 +3218,30 @@
                 <w:lang w:val="en-US"/>
               </w:rPr>
             </w:pPr>
+            <w:r>
+              <w:rPr>
+                <w:rFonts w:ascii="Century Gothic" w:hAnsi="Century Gothic"/>
+                <w:lang w:val="en-US"/>
+              </w:rPr>
+              <w:t>Requête n°</w:t>
+            </w:r>
+            <w:proofErr w:type="gramStart"/>
+            <w:r>
+              <w:rPr>
+                <w:rFonts w:ascii="Century Gothic" w:hAnsi="Century Gothic"/>
+                <w:lang w:val="en-US"/>
+              </w:rPr>
+              <w:t>2 :</w:t>
+            </w:r>
+            <w:proofErr w:type="gramEnd"/>
+          </w:p>
+          <w:p>
+            <w:pPr>
+              <w:rPr>
+                <w:rFonts w:ascii="Century Gothic" w:hAnsi="Century Gothic"/>
+                <w:lang w:val="en-US"/>
+              </w:rPr>
+            </w:pPr>
           </w:p>
           <w:p>
             <w:pPr>
@@ -3155,7 +3256,23 @@
                 <w:rFonts w:ascii="Century Gothic" w:hAnsi="Century Gothic"/>
                 <w:lang w:val="en-US"/>
               </w:rPr>
-              <w:t>SELECT a.npa AS zone_npa, COUNT(c.commande_id) AS nb</w:t>
+              <w:t>SELECT a.npa AS zone_npa, COUNT(</w:t>
+            </w:r>
+            <w:proofErr w:type="gramStart"/>
+            <w:r>
+              <w:rPr>
+                <w:rFonts w:ascii="Century Gothic" w:hAnsi="Century Gothic"/>
+                <w:lang w:val="en-US"/>
+              </w:rPr>
+              <w:t>c.commande</w:t>
+            </w:r>
+            <w:proofErr w:type="gramEnd"/>
+            <w:r>
+              <w:rPr>
+                <w:rFonts w:ascii="Century Gothic" w:hAnsi="Century Gothic"/>
+                <w:lang w:val="en-US"/>
+              </w:rPr>
+              <w:t>_id) AS nb</w:t>
             </w:r>
           </w:p>
           <w:p>
@@ -3179,6 +3296,86 @@
               <w:shd w:val="clear" w:color="auto" w:fill="E8E8E8" w:themeFill="background2"/>
               <w:rPr>
                 <w:rFonts w:ascii="Century Gothic" w:hAnsi="Century Gothic"/>
+                <w:lang w:val="fr-CH"/>
+              </w:rPr>
+            </w:pPr>
+            <w:r>
+              <w:rPr>
+                <w:rFonts w:ascii="Century Gothic" w:hAnsi="Century Gothic"/>
+                <w:lang w:val="fr-CH"/>
+              </w:rPr>
+              <w:t xml:space="preserve">JOIN </w:t>
+            </w:r>
+            <w:proofErr w:type="spellStart"/>
+            <w:r>
+              <w:rPr>
+                <w:rFonts w:ascii="Century Gothic" w:hAnsi="Century Gothic"/>
+                <w:lang w:val="fr-CH"/>
+              </w:rPr>
+              <w:t>t_adresse</w:t>
+            </w:r>
+            <w:proofErr w:type="spellEnd"/>
+            <w:r>
+              <w:rPr>
+                <w:rFonts w:ascii="Century Gothic" w:hAnsi="Century Gothic"/>
+                <w:lang w:val="fr-CH"/>
+              </w:rPr>
+              <w:t xml:space="preserve"> AS a ON </w:t>
+            </w:r>
+            <w:proofErr w:type="spellStart"/>
+            <w:r>
+              <w:rPr>
+                <w:rFonts w:ascii="Century Gothic" w:hAnsi="Century Gothic"/>
+                <w:lang w:val="fr-CH"/>
+              </w:rPr>
+              <w:t>c.adresse</w:t>
+            </w:r>
+            <w:proofErr w:type="spellEnd"/>
+            <w:r>
+              <w:rPr>
+                <w:rFonts w:ascii="Century Gothic" w:hAnsi="Century Gothic"/>
+                <w:lang w:val="fr-CH"/>
+              </w:rPr>
+              <w:t xml:space="preserve"> </w:t>
+            </w:r>
+            <w:r>
+              <w:rPr>
+                <w:rFonts w:ascii="Century Gothic" w:hAnsi="Century Gothic"/>
+                <w:lang w:val="fr-CH"/>
+              </w:rPr>
+              <w:t>_</w:t>
+            </w:r>
+            <w:proofErr w:type="spellStart"/>
+            <w:r>
+              <w:rPr>
+                <w:rFonts w:ascii="Century Gothic" w:hAnsi="Century Gothic"/>
+                <w:lang w:val="fr-CH"/>
+              </w:rPr>
+              <w:t>fk</w:t>
+            </w:r>
+            <w:proofErr w:type="spellEnd"/>
+            <w:r>
+              <w:rPr>
+                <w:rFonts w:ascii="Century Gothic" w:hAnsi="Century Gothic"/>
+                <w:lang w:val="fr-CH"/>
+              </w:rPr>
+              <w:t xml:space="preserve"> = </w:t>
+            </w:r>
+            <w:proofErr w:type="spellStart"/>
+            <w:r>
+              <w:rPr>
+                <w:rFonts w:ascii="Century Gothic" w:hAnsi="Century Gothic"/>
+                <w:lang w:val="fr-CH"/>
+              </w:rPr>
+              <w:t>a.adresse_id</w:t>
+            </w:r>
+            <w:proofErr w:type="spellEnd"/>
+          </w:p>
+          <w:p>
+            <w:pPr>
+              <w:shd w:val="clear" w:color="auto" w:fill="E8E8E8" w:themeFill="background2"/>
+              <w:rPr>
+                <w:rFonts w:ascii="Century Gothic" w:hAnsi="Century Gothic"/>
                 <w:lang w:val="en-US"/>
               </w:rPr>
             </w:pPr>
@@ -3187,23 +3384,23 @@
                 <w:rFonts w:ascii="Century Gothic" w:hAnsi="Century Gothic"/>
                 <w:lang w:val="en-US"/>
               </w:rPr>
-              <w:t>JOIN t_adresse AS a ON c.adresse_livraison_fk = a.adresse_id</w:t>
-            </w:r>
-          </w:p>
-          <w:p>
-            <w:pPr>
-              <w:shd w:val="clear" w:color="auto" w:fill="E8E8E8" w:themeFill="background2"/>
+              <w:t xml:space="preserve">WHERE </w:t>
+            </w:r>
+            <w:proofErr w:type="spellStart"/>
+            <w:r>
               <w:rPr>
                 <w:rFonts w:ascii="Century Gothic" w:hAnsi="Century Gothic"/>
                 <w:lang w:val="en-US"/>
               </w:rPr>
-            </w:pPr>
+              <w:t>c.type</w:t>
+            </w:r>
+            <w:proofErr w:type="spellEnd"/>
             <w:r>
               <w:rPr>
                 <w:rFonts w:ascii="Century Gothic" w:hAnsi="Century Gothic"/>
                 <w:lang w:val="en-US"/>
               </w:rPr>
-              <w:t>WHERE c.type = 'livraison' AND HOUR(c.date_creation) BETWEEN 18 AND 21</w:t>
+              <w:t xml:space="preserve"> = 'livraison' AND HOUR(c.date_creation) BETWEEN 18 AND 21</w:t>
             </w:r>
           </w:p>
           <w:p>
@@ -3707,7 +3904,7 @@
 </file>
 
 <file path=word/endnotes.xml><?xml version="1.0" encoding="utf-8"?>
-<w:endnotes xmlns:wpc="http://schemas.microsoft.com/office/word/2010/wordprocessingCanvas" xmlns:cx="http://schemas.microsoft.com/office/drawing/2014/chartex" xmlns:cx1="http://schemas.microsoft.com/office/drawing/2015/9/8/chartex" xmlns:cx2="http://schemas.microsoft.com/office/drawing/2015/10/21/chartex" xmlns:cx3="http://schemas.microsoft.com/office/drawing/2016/5/9/chartex" xmlns:cx4="http://schemas.microsoft.com/office/drawing/2016/5/10/chartex" xmlns:cx5="http://schemas.microsoft.com/office/drawing/2016/5/11/chartex" xmlns:cx6="http://schemas.microsoft.com/office/drawing/2016/5/12/chartex" xmlns:cx7="http://schemas.microsoft.com/office/drawing/2016/5/13/chartex" xmlns:cx8="http://schemas.microsoft.com/office/drawing/2016/5/14/chartex" xmlns:mc="http://schemas.openxmlformats.org/markup-compatibility/2006" xmlns:aink="http://schemas.microsoft.com/office/drawing/2016/ink" xmlns:am3d="http://schemas.microsoft.com/office/drawing/2017/model3d" xmlns:o="urn:schemas-microsoft-com:office:office" xmlns:oel="http://schemas.microsoft.com/office/2019/extlst" xmlns:r="http://schemas.openxmlformats.org/officeDocument/2006/relationships" xmlns:m="http://schemas.openxmlformats.org/officeDocument/2006/math" xmlns:v="urn:schemas-microsoft-com:vml" xmlns:wp14="http://schemas.microsoft.com/office/word/2010/wordprocessingDrawing" xmlns:wp="http://schemas.openxmlformats.org/drawingml/2006/wordprocessingDrawing" xmlns:w10="urn:schemas-microsoft-com:office:word" xmlns:w="http://schemas.openxmlformats.org/wordprocessingml/2006/main" xmlns:w14="http://schemas.microsoft.com/office/word/2010/wordml" xmlns:w15="http://schemas.microsoft.com/office/word/2012/wordml" xmlns:w16cex="http://schemas.microsoft.com/office/word/2018/wordml/cex" xmlns:w16cid="http://schemas.microsoft.com/office/word/2016/wordml/cid" xmlns:w16="http://schemas.microsoft.com/office/word/2018/wordml" xmlns:w16du="http://schemas.microsoft.com/office/word/2023/wordml/word16du" xmlns:w16sdtdh="http://schemas.microsoft.com/office/word/2020/wordml/sdtdatahash" xmlns:w16sdtfl="http://schemas.microsoft.com/office/word/2024/wordml/sdtformatlock" xmlns:w16se="http://schemas.microsoft.com/office/word/2015/wordml/symex" xmlns:wpg="http://schemas.microsoft.com/office/word/2010/wordprocessingGroup" xmlns:wpi="http://schemas.microsoft.com/office/word/2010/wordprocessingInk" xmlns:wne="http://schemas.microsoft.com/office/word/2006/wordml" xmlns:wps="http://schemas.microsoft.com/office/word/2010/wordprocessingShape" mc:Ignorable="w14 w15 w16se w16cid w16 w16cex w16sdtdh w16sdtfl w16du wp14">
+<w:endnotes xmlns:wpc="http://schemas.microsoft.com/office/word/2010/wordprocessingCanvas" xmlns:cx="http://schemas.microsoft.com/office/drawing/2014/chartex" xmlns:cx1="http://schemas.microsoft.com/office/drawing/2015/9/8/chartex" xmlns:cx2="http://schemas.microsoft.com/office/drawing/2015/10/21/chartex" xmlns:cx3="http://schemas.microsoft.com/office/drawing/2016/5/9/chartex" xmlns:cx4="http://schemas.microsoft.com/office/drawing/2016/5/10/chartex" xmlns:cx5="http://schemas.microsoft.com/office/drawing/2016/5/11/chartex" xmlns:cx6="http://schemas.microsoft.com/office/drawing/2016/5/12/chartex" xmlns:cx7="http://schemas.microsoft.com/office/drawing/2016/5/13/chartex" xmlns:cx8="http://schemas.microsoft.com/office/drawing/2016/5/14/chartex" xmlns:mc="http://schemas.openxmlformats.org/markup-compatibility/2006" xmlns:aink="http://schemas.microsoft.com/office/drawing/2016/ink" xmlns:am3d="http://schemas.microsoft.com/office/drawing/2017/model3d" xmlns:o="urn:schemas-microsoft-com:office:office" xmlns:oel="http://schemas.microsoft.com/office/2019/extlst" xmlns:r="http://schemas.openxmlformats.org/officeDocument/2006/relationships" xmlns:m="http://schemas.openxmlformats.org/officeDocument/2006/math" xmlns:v="urn:schemas-microsoft-com:vml" xmlns:wp14="http://schemas.microsoft.com/office/word/2010/wordprocessingDrawing" xmlns:wp="http://schemas.openxmlformats.org/drawingml/2006/wordprocessingDrawing" xmlns:w10="urn:schemas-microsoft-com:office:word" xmlns:w="http://schemas.openxmlformats.org/wordprocessingml/2006/main" xmlns:w14="http://schemas.microsoft.com/office/word/2010/wordml" xmlns:w15="http://schemas.microsoft.com/office/word/2012/wordml" xmlns:w16cex="http://schemas.microsoft.com/office/word/2018/wordml/cex" xmlns:w16cid="http://schemas.microsoft.com/office/word/2016/wordml/cid" xmlns:w16="http://schemas.microsoft.com/office/word/2018/wordml" xmlns:w16sdtdh="http://schemas.microsoft.com/office/word/2020/wordml/sdtdatahash" xmlns:w16se="http://schemas.microsoft.com/office/word/2015/wordml/symex" xmlns:wpg="http://schemas.microsoft.com/office/word/2010/wordprocessingGroup" xmlns:wpi="http://schemas.microsoft.com/office/word/2010/wordprocessingInk" xmlns:wne="http://schemas.microsoft.com/office/word/2006/wordml" xmlns:wps="http://schemas.microsoft.com/office/word/2010/wordprocessingShape" mc:Ignorable="w14 w15 w16se w16cid w16 w16cex w16sdtdh wp14">
   <w:endnote w:type="separator" w:id="-1">
     <w:p>
       <w:r>
@@ -3726,7 +3923,7 @@
 </file>
 
 <file path=word/footnotes.xml><?xml version="1.0" encoding="utf-8"?>
-<w:footnotes xmlns:wpc="http://schemas.microsoft.com/office/word/2010/wordprocessingCanvas" xmlns:cx="http://schemas.microsoft.com/office/drawing/2014/chartex" xmlns:cx1="http://schemas.microsoft.com/office/drawing/2015/9/8/chartex" xmlns:cx2="http://schemas.microsoft.com/office/drawing/2015/10/21/chartex" xmlns:cx3="http://schemas.microsoft.com/office/drawing/2016/5/9/chartex" xmlns:cx4="http://schemas.microsoft.com/office/drawing/2016/5/10/chartex" xmlns:cx5="http://schemas.microsoft.com/office/drawing/2016/5/11/chartex" xmlns:cx6="http://schemas.microsoft.com/office/drawing/2016/5/12/chartex" xmlns:cx7="http://schemas.microsoft.com/office/drawing/2016/5/13/chartex" xmlns:cx8="http://schemas.microsoft.com/office/drawing/2016/5/14/chartex" xmlns:mc="http://schemas.openxmlformats.org/markup-compatibility/2006" xmlns:aink="http://schemas.microsoft.com/office/drawing/2016/ink" xmlns:am3d="http://schemas.microsoft.com/office/drawing/2017/model3d" xmlns:o="urn:schemas-microsoft-com:office:office" xmlns:oel="http://schemas.microsoft.com/office/2019/extlst" xmlns:r="http://schemas.openxmlformats.org/officeDocument/2006/relationships" xmlns:m="http://schemas.openxmlformats.org/officeDocument/2006/math" xmlns:v="urn:schemas-microsoft-com:vml" xmlns:wp14="http://schemas.microsoft.com/office/word/2010/wordprocessingDrawing" xmlns:wp="http://schemas.openxmlformats.org/drawingml/2006/wordprocessingDrawing" xmlns:w10="urn:schemas-microsoft-com:office:word" xmlns:w="http://schemas.openxmlformats.org/wordprocessingml/2006/main" xmlns:w14="http://schemas.microsoft.com/office/word/2010/wordml" xmlns:w15="http://schemas.microsoft.com/office/word/2012/wordml" xmlns:w16cex="http://schemas.microsoft.com/office/word/2018/wordml/cex" xmlns:w16cid="http://schemas.microsoft.com/office/word/2016/wordml/cid" xmlns:w16="http://schemas.microsoft.com/office/word/2018/wordml" xmlns:w16du="http://schemas.microsoft.com/office/word/2023/wordml/word16du" xmlns:w16sdtdh="http://schemas.microsoft.com/office/word/2020/wordml/sdtdatahash" xmlns:w16sdtfl="http://schemas.microsoft.com/office/word/2024/wordml/sdtformatlock" xmlns:w16se="http://schemas.microsoft.com/office/word/2015/wordml/symex" xmlns:wpg="http://schemas.microsoft.com/office/word/2010/wordprocessingGroup" xmlns:wpi="http://schemas.microsoft.com/office/word/2010/wordprocessingInk" xmlns:wne="http://schemas.microsoft.com/office/word/2006/wordml" xmlns:wps="http://schemas.microsoft.com/office/word/2010/wordprocessingShape" mc:Ignorable="w14 w15 w16se w16cid w16 w16cex w16sdtdh w16sdtfl w16du wp14">
+<w:footnotes xmlns:wpc="http://schemas.microsoft.com/office/word/2010/wordprocessingCanvas" xmlns:cx="http://schemas.microsoft.com/office/drawing/2014/chartex" xmlns:cx1="http://schemas.microsoft.com/office/drawing/2015/9/8/chartex" xmlns:cx2="http://schemas.microsoft.com/office/drawing/2015/10/21/chartex" xmlns:cx3="http://schemas.microsoft.com/office/drawing/2016/5/9/chartex" xmlns:cx4="http://schemas.microsoft.com/office/drawing/2016/5/10/chartex" xmlns:cx5="http://schemas.microsoft.com/office/drawing/2016/5/11/chartex" xmlns:cx6="http://schemas.microsoft.com/office/drawing/2016/5/12/chartex" xmlns:cx7="http://schemas.microsoft.com/office/drawing/2016/5/13/chartex" xmlns:cx8="http://schemas.microsoft.com/office/drawing/2016/5/14/chartex" xmlns:mc="http://schemas.openxmlformats.org/markup-compatibility/2006" xmlns:aink="http://schemas.microsoft.com/office/drawing/2016/ink" xmlns:am3d="http://schemas.microsoft.com/office/drawing/2017/model3d" xmlns:o="urn:schemas-microsoft-com:office:office" xmlns:oel="http://schemas.microsoft.com/office/2019/extlst" xmlns:r="http://schemas.openxmlformats.org/officeDocument/2006/relationships" xmlns:m="http://schemas.openxmlformats.org/officeDocument/2006/math" xmlns:v="urn:schemas-microsoft-com:vml" xmlns:wp14="http://schemas.microsoft.com/office/word/2010/wordprocessingDrawing" xmlns:wp="http://schemas.openxmlformats.org/drawingml/2006/wordprocessingDrawing" xmlns:w10="urn:schemas-microsoft-com:office:word" xmlns:w="http://schemas.openxmlformats.org/wordprocessingml/2006/main" xmlns:w14="http://schemas.microsoft.com/office/word/2010/wordml" xmlns:w15="http://schemas.microsoft.com/office/word/2012/wordml" xmlns:w16cex="http://schemas.microsoft.com/office/word/2018/wordml/cex" xmlns:w16cid="http://schemas.microsoft.com/office/word/2016/wordml/cid" xmlns:w16="http://schemas.microsoft.com/office/word/2018/wordml" xmlns:w16sdtdh="http://schemas.microsoft.com/office/word/2020/wordml/sdtdatahash" xmlns:w16se="http://schemas.microsoft.com/office/word/2015/wordml/symex" xmlns:wpg="http://schemas.microsoft.com/office/word/2010/wordprocessingGroup" xmlns:wpi="http://schemas.microsoft.com/office/word/2010/wordprocessingInk" xmlns:wne="http://schemas.microsoft.com/office/word/2006/wordml" xmlns:wps="http://schemas.microsoft.com/office/word/2010/wordprocessingShape" mc:Ignorable="w14 w15 w16se w16cid w16 w16cex w16sdtdh wp14">
   <w:footnote w:type="separator" w:id="-1">
     <w:p>
       <w:r>
@@ -3745,7 +3942,7 @@
 </file>
 
 <file path=word/header1.xml><?xml version="1.0" encoding="utf-8"?>
-<w:hdr xmlns:wpc="http://schemas.microsoft.com/office/word/2010/wordprocessingCanvas" xmlns:cx="http://schemas.microsoft.com/office/drawing/2014/chartex" xmlns:cx1="http://schemas.microsoft.com/office/drawing/2015/9/8/chartex" xmlns:cx2="http://schemas.microsoft.com/office/drawing/2015/10/21/chartex" xmlns:cx3="http://schemas.microsoft.com/office/drawing/2016/5/9/chartex" xmlns:cx4="http://schemas.microsoft.com/office/drawing/2016/5/10/chartex" xmlns:cx5="http://schemas.microsoft.com/office/drawing/2016/5/11/chartex" xmlns:cx6="http://schemas.microsoft.com/office/drawing/2016/5/12/chartex" xmlns:cx7="http://schemas.microsoft.com/office/drawing/2016/5/13/chartex" xmlns:cx8="http://schemas.microsoft.com/office/drawing/2016/5/14/chartex" xmlns:mc="http://schemas.openxmlformats.org/markup-compatibility/2006" xmlns:aink="http://schemas.microsoft.com/office/drawing/2016/ink" xmlns:am3d="http://schemas.microsoft.com/office/drawing/2017/model3d" xmlns:o="urn:schemas-microsoft-com:office:office" xmlns:oel="http://schemas.microsoft.com/office/2019/extlst" xmlns:r="http://schemas.openxmlformats.org/officeDocument/2006/relationships" xmlns:m="http://schemas.openxmlformats.org/officeDocument/2006/math" xmlns:v="urn:schemas-microsoft-com:vml" xmlns:wp14="http://schemas.microsoft.com/office/word/2010/wordprocessingDrawing" xmlns:wp="http://schemas.openxmlformats.org/drawingml/2006/wordprocessingDrawing" xmlns:w10="urn:schemas-microsoft-com:office:word" xmlns:w="http://schemas.openxmlformats.org/wordprocessingml/2006/main" xmlns:w14="http://schemas.microsoft.com/office/word/2010/wordml" xmlns:w15="http://schemas.microsoft.com/office/word/2012/wordml" xmlns:w16cex="http://schemas.microsoft.com/office/word/2018/wordml/cex" xmlns:w16cid="http://schemas.microsoft.com/office/word/2016/wordml/cid" xmlns:w16="http://schemas.microsoft.com/office/word/2018/wordml" xmlns:w16du="http://schemas.microsoft.com/office/word/2023/wordml/word16du" xmlns:w16sdtdh="http://schemas.microsoft.com/office/word/2020/wordml/sdtdatahash" xmlns:w16sdtfl="http://schemas.microsoft.com/office/word/2024/wordml/sdtformatlock" xmlns:w16se="http://schemas.microsoft.com/office/word/2015/wordml/symex" xmlns:wpg="http://schemas.microsoft.com/office/word/2010/wordprocessingGroup" xmlns:wpi="http://schemas.microsoft.com/office/word/2010/wordprocessingInk" xmlns:wne="http://schemas.microsoft.com/office/word/2006/wordml" xmlns:wps="http://schemas.microsoft.com/office/word/2010/wordprocessingShape" mc:Ignorable="w14 w15 w16se w16cid w16 w16cex w16sdtdh w16sdtfl w16du wp14">
+<w:hdr xmlns:wpc="http://schemas.microsoft.com/office/word/2010/wordprocessingCanvas" xmlns:cx="http://schemas.microsoft.com/office/drawing/2014/chartex" xmlns:cx1="http://schemas.microsoft.com/office/drawing/2015/9/8/chartex" xmlns:cx2="http://schemas.microsoft.com/office/drawing/2015/10/21/chartex" xmlns:cx3="http://schemas.microsoft.com/office/drawing/2016/5/9/chartex" xmlns:cx4="http://schemas.microsoft.com/office/drawing/2016/5/10/chartex" xmlns:cx5="http://schemas.microsoft.com/office/drawing/2016/5/11/chartex" xmlns:cx6="http://schemas.microsoft.com/office/drawing/2016/5/12/chartex" xmlns:cx7="http://schemas.microsoft.com/office/drawing/2016/5/13/chartex" xmlns:cx8="http://schemas.microsoft.com/office/drawing/2016/5/14/chartex" xmlns:mc="http://schemas.openxmlformats.org/markup-compatibility/2006" xmlns:aink="http://schemas.microsoft.com/office/drawing/2016/ink" xmlns:am3d="http://schemas.microsoft.com/office/drawing/2017/model3d" xmlns:o="urn:schemas-microsoft-com:office:office" xmlns:oel="http://schemas.microsoft.com/office/2019/extlst" xmlns:r="http://schemas.openxmlformats.org/officeDocument/2006/relationships" xmlns:m="http://schemas.openxmlformats.org/officeDocument/2006/math" xmlns:v="urn:schemas-microsoft-com:vml" xmlns:wp14="http://schemas.microsoft.com/office/word/2010/wordprocessingDrawing" xmlns:wp="http://schemas.openxmlformats.org/drawingml/2006/wordprocessingDrawing" xmlns:w10="urn:schemas-microsoft-com:office:word" xmlns:w="http://schemas.openxmlformats.org/wordprocessingml/2006/main" xmlns:w14="http://schemas.microsoft.com/office/word/2010/wordml" xmlns:w15="http://schemas.microsoft.com/office/word/2012/wordml" xmlns:w16cex="http://schemas.microsoft.com/office/word/2018/wordml/cex" xmlns:w16cid="http://schemas.microsoft.com/office/word/2016/wordml/cid" xmlns:w16="http://schemas.microsoft.com/office/word/2018/wordml" xmlns:w16sdtdh="http://schemas.microsoft.com/office/word/2020/wordml/sdtdatahash" xmlns:w16se="http://schemas.microsoft.com/office/word/2015/wordml/symex" xmlns:wpg="http://schemas.microsoft.com/office/word/2010/wordprocessingGroup" xmlns:wpi="http://schemas.microsoft.com/office/word/2010/wordprocessingInk" xmlns:wne="http://schemas.microsoft.com/office/word/2006/wordml" xmlns:wps="http://schemas.microsoft.com/office/word/2010/wordprocessingShape" mc:Ignorable="w14 w15 w16se w16cid w16 w16cex w16sdtdh wp14">
   <w:tbl>
     <w:tblPr>
       <w:tblW w:w="10080" w:type="dxa"/>
@@ -3921,7 +4118,7 @@
 </file>
 
 <file path=word/numbering.xml><?xml version="1.0" encoding="utf-8"?>
-<w:numbering xmlns:wpc="http://schemas.microsoft.com/office/word/2010/wordprocessingCanvas" xmlns:cx="http://schemas.microsoft.com/office/drawing/2014/chartex" xmlns:cx1="http://schemas.microsoft.com/office/drawing/2015/9/8/chartex" xmlns:cx2="http://schemas.microsoft.com/office/drawing/2015/10/21/chartex" xmlns:cx3="http://schemas.microsoft.com/office/drawing/2016/5/9/chartex" xmlns:cx4="http://schemas.microsoft.com/office/drawing/2016/5/10/chartex" xmlns:cx5="http://schemas.microsoft.com/office/drawing/2016/5/11/chartex" xmlns:cx6="http://schemas.microsoft.com/office/drawing/2016/5/12/chartex" xmlns:cx7="http://schemas.microsoft.com/office/drawing/2016/5/13/chartex" xmlns:cx8="http://schemas.microsoft.com/office/drawing/2016/5/14/chartex" xmlns:mc="http://schemas.openxmlformats.org/markup-compatibility/2006" xmlns:aink="http://schemas.microsoft.com/office/drawing/2016/ink" xmlns:am3d="http://schemas.microsoft.com/office/drawing/2017/model3d" xmlns:o="urn:schemas-microsoft-com:office:office" xmlns:oel="http://schemas.microsoft.com/office/2019/extlst" xmlns:r="http://schemas.openxmlformats.org/officeDocument/2006/relationships" xmlns:m="http://schemas.openxmlformats.org/officeDocument/2006/math" xmlns:v="urn:schemas-microsoft-com:vml" xmlns:wp14="http://schemas.microsoft.com/office/word/2010/wordprocessingDrawing" xmlns:wp="http://schemas.openxmlformats.org/drawingml/2006/wordprocessingDrawing" xmlns:w10="urn:schemas-microsoft-com:office:word" xmlns:w="http://schemas.openxmlformats.org/wordprocessingml/2006/main" xmlns:w14="http://schemas.microsoft.com/office/word/2010/wordml" xmlns:w15="http://schemas.microsoft.com/office/word/2012/wordml" xmlns:w16cex="http://schemas.microsoft.com/office/word/2018/wordml/cex" xmlns:w16cid="http://schemas.microsoft.com/office/word/2016/wordml/cid" xmlns:w16="http://schemas.microsoft.com/office/word/2018/wordml" xmlns:w16du="http://schemas.microsoft.com/office/word/2023/wordml/word16du" xmlns:w16sdtdh="http://schemas.microsoft.com/office/word/2020/wordml/sdtdatahash" xmlns:w16sdtfl="http://schemas.microsoft.com/office/word/2024/wordml/sdtformatlock" xmlns:w16se="http://schemas.microsoft.com/office/word/2015/wordml/symex" xmlns:wpg="http://schemas.microsoft.com/office/word/2010/wordprocessingGroup" xmlns:wpi="http://schemas.microsoft.com/office/word/2010/wordprocessingInk" xmlns:wne="http://schemas.microsoft.com/office/word/2006/wordml" xmlns:wps="http://schemas.microsoft.com/office/word/2010/wordprocessingShape" mc:Ignorable="w14 w15 w16se w16cid w16 w16cex w16sdtdh w16sdtfl w16du wp14">
+<w:numbering xmlns:wpc="http://schemas.microsoft.com/office/word/2010/wordprocessingCanvas" xmlns:cx="http://schemas.microsoft.com/office/drawing/2014/chartex" xmlns:cx1="http://schemas.microsoft.com/office/drawing/2015/9/8/chartex" xmlns:cx2="http://schemas.microsoft.com/office/drawing/2015/10/21/chartex" xmlns:cx3="http://schemas.microsoft.com/office/drawing/2016/5/9/chartex" xmlns:cx4="http://schemas.microsoft.com/office/drawing/2016/5/10/chartex" xmlns:cx5="http://schemas.microsoft.com/office/drawing/2016/5/11/chartex" xmlns:cx6="http://schemas.microsoft.com/office/drawing/2016/5/12/chartex" xmlns:cx7="http://schemas.microsoft.com/office/drawing/2016/5/13/chartex" xmlns:cx8="http://schemas.microsoft.com/office/drawing/2016/5/14/chartex" xmlns:mc="http://schemas.openxmlformats.org/markup-compatibility/2006" xmlns:aink="http://schemas.microsoft.com/office/drawing/2016/ink" xmlns:am3d="http://schemas.microsoft.com/office/drawing/2017/model3d" xmlns:o="urn:schemas-microsoft-com:office:office" xmlns:oel="http://schemas.microsoft.com/office/2019/extlst" xmlns:r="http://schemas.openxmlformats.org/officeDocument/2006/relationships" xmlns:m="http://schemas.openxmlformats.org/officeDocument/2006/math" xmlns:v="urn:schemas-microsoft-com:vml" xmlns:wp14="http://schemas.microsoft.com/office/word/2010/wordprocessingDrawing" xmlns:wp="http://schemas.openxmlformats.org/drawingml/2006/wordprocessingDrawing" xmlns:w10="urn:schemas-microsoft-com:office:word" xmlns:w="http://schemas.openxmlformats.org/wordprocessingml/2006/main" xmlns:w14="http://schemas.microsoft.com/office/word/2010/wordml" xmlns:w15="http://schemas.microsoft.com/office/word/2012/wordml" xmlns:w16cex="http://schemas.microsoft.com/office/word/2018/wordml/cex" xmlns:w16cid="http://schemas.microsoft.com/office/word/2016/wordml/cid" xmlns:w16="http://schemas.microsoft.com/office/word/2018/wordml" xmlns:w16sdtdh="http://schemas.microsoft.com/office/word/2020/wordml/sdtdatahash" xmlns:w16se="http://schemas.microsoft.com/office/word/2015/wordml/symex" xmlns:wpg="http://schemas.microsoft.com/office/word/2010/wordprocessingGroup" xmlns:wpi="http://schemas.microsoft.com/office/word/2010/wordprocessingInk" xmlns:wne="http://schemas.microsoft.com/office/word/2006/wordml" xmlns:wps="http://schemas.microsoft.com/office/word/2010/wordprocessingShape" mc:Ignorable="w14 w15 w16se w16cid w16 w16cex w16sdtdh wp14">
   <w:abstractNum w:abstractNumId="0" w15:restartNumberingAfterBreak="0">
     <w:nsid w:val="016F1E6A"/>
     <w:multiLevelType w:val="hybridMultilevel"/>
@@ -5092,7 +5289,7 @@
 </file>
 
 <file path=word/styles.xml><?xml version="1.0" encoding="utf-8"?>
-<w:styles xmlns:mc="http://schemas.openxmlformats.org/markup-compatibility/2006" xmlns:r="http://schemas.openxmlformats.org/officeDocument/2006/relationships" xmlns:w="http://schemas.openxmlformats.org/wordprocessingml/2006/main" xmlns:w14="http://schemas.microsoft.com/office/word/2010/wordml" xmlns:w15="http://schemas.microsoft.com/office/word/2012/wordml" xmlns:w16cex="http://schemas.microsoft.com/office/word/2018/wordml/cex" xmlns:w16cid="http://schemas.microsoft.com/office/word/2016/wordml/cid" xmlns:w16="http://schemas.microsoft.com/office/word/2018/wordml" xmlns:w16du="http://schemas.microsoft.com/office/word/2023/wordml/word16du" xmlns:w16sdtdh="http://schemas.microsoft.com/office/word/2020/wordml/sdtdatahash" xmlns:w16sdtfl="http://schemas.microsoft.com/office/word/2024/wordml/sdtformatlock" xmlns:w16se="http://schemas.microsoft.com/office/word/2015/wordml/symex" mc:Ignorable="w14 w15 w16se w16cid w16 w16cex w16sdtdh w16sdtfl w16du">
+<w:styles xmlns:mc="http://schemas.openxmlformats.org/markup-compatibility/2006" xmlns:r="http://schemas.openxmlformats.org/officeDocument/2006/relationships" xmlns:w="http://schemas.openxmlformats.org/wordprocessingml/2006/main" xmlns:w14="http://schemas.microsoft.com/office/word/2010/wordml" xmlns:w15="http://schemas.microsoft.com/office/word/2012/wordml" xmlns:w16cex="http://schemas.microsoft.com/office/word/2018/wordml/cex" xmlns:w16cid="http://schemas.microsoft.com/office/word/2016/wordml/cid" xmlns:w16="http://schemas.microsoft.com/office/word/2018/wordml" xmlns:w16sdtdh="http://schemas.microsoft.com/office/word/2020/wordml/sdtdatahash" xmlns:w16se="http://schemas.microsoft.com/office/word/2015/wordml/symex" mc:Ignorable="w14 w15 w16se w16cid w16 w16cex w16sdtdh">
   <w:docDefaults>
     <w:rPrDefault>
       <w:rPr>
@@ -6451,26 +6648,6 @@
 </file>
 
 <file path=customXml/item1.xml><?xml version="1.0" encoding="utf-8"?>
-<p:properties xmlns:p="http://schemas.microsoft.com/office/2006/metadata/properties" xmlns:xsi="http://www.w3.org/2001/XMLSchema-instance" xmlns:pc="http://schemas.microsoft.com/office/infopath/2007/PartnerControls">
-  <documentManagement>
-    <lcf76f155ced4ddcb4097134ff3c332f xmlns="f20a0681-8b2f-4a46-9dab-cf1520193f81">
-      <Terms xmlns="http://schemas.microsoft.com/office/infopath/2007/PartnerControls"/>
-    </lcf76f155ced4ddcb4097134ff3c332f>
-    <TaxCatchAll xmlns="932fafb7-d8e0-4a14-bee3-33aad5c71309" xsi:nil="true"/>
-  </documentManagement>
-</p:properties>
-</file>
-
-<file path=customXml/item2.xml><?xml version="1.0" encoding="utf-8"?>
-<?mso-contentType ?>
-<FormTemplates xmlns="http://schemas.microsoft.com/sharepoint/v3/contenttype/forms">
-  <Display>DocumentLibraryForm</Display>
-  <Edit>DocumentLibraryForm</Edit>
-  <New>DocumentLibraryForm</New>
-</FormTemplates>
-</file>
-
-<file path=customXml/item3.xml><?xml version="1.0" encoding="utf-8"?>
 <ct:contentTypeSchema xmlns:ct="http://schemas.microsoft.com/office/2006/metadata/contentType" xmlns:ma="http://schemas.microsoft.com/office/2006/metadata/properties/metaAttributes" ct:_="" ma:_="" ma:contentTypeName="Document" ma:contentTypeID="0x0101005B1120F001D1794FAA6F4057E3355991" ma:contentTypeVersion="10" ma:contentTypeDescription="Crée un document." ma:contentTypeScope="" ma:versionID="b4a5ad45c54fa8cfccf4b5a6490850dd">
   <xsd:schema xmlns:xsd="http://www.w3.org/2001/XMLSchema" xmlns:xs="http://www.w3.org/2001/XMLSchema" xmlns:p="http://schemas.microsoft.com/office/2006/metadata/properties" xmlns:ns2="f20a0681-8b2f-4a46-9dab-cf1520193f81" xmlns:ns3="932fafb7-d8e0-4a14-bee3-33aad5c71309" targetNamespace="http://schemas.microsoft.com/office/2006/metadata/properties" ma:root="true" ma:fieldsID="fe3b3ea8edd81a9012b97c6ddf640adc" ns2:_="" ns3:_="">
     <xsd:import namespace="f20a0681-8b2f-4a46-9dab-cf1520193f81"/>
@@ -6659,13 +6836,41 @@
 </ct:contentTypeSchema>
 </file>
 
+<file path=customXml/item2.xml><?xml version="1.0" encoding="utf-8"?>
+<?mso-contentType ?>
+<FormTemplates xmlns="http://schemas.microsoft.com/sharepoint/v3/contenttype/forms">
+  <Display>DocumentLibraryForm</Display>
+  <Edit>DocumentLibraryForm</Edit>
+  <New>DocumentLibraryForm</New>
+</FormTemplates>
+</file>
+
+<file path=customXml/item3.xml><?xml version="1.0" encoding="utf-8"?>
+<p:properties xmlns:p="http://schemas.microsoft.com/office/2006/metadata/properties" xmlns:xsi="http://www.w3.org/2001/XMLSchema-instance" xmlns:pc="http://schemas.microsoft.com/office/infopath/2007/PartnerControls">
+  <documentManagement>
+    <lcf76f155ced4ddcb4097134ff3c332f xmlns="f20a0681-8b2f-4a46-9dab-cf1520193f81">
+      <Terms xmlns="http://schemas.microsoft.com/office/infopath/2007/PartnerControls"/>
+    </lcf76f155ced4ddcb4097134ff3c332f>
+    <TaxCatchAll xmlns="932fafb7-d8e0-4a14-bee3-33aad5c71309" xsi:nil="true"/>
+  </documentManagement>
+</p:properties>
+</file>
+
 <file path=customXml/itemProps1.xml><?xml version="1.0" encoding="utf-8"?>
-<ds:datastoreItem xmlns:ds="http://schemas.openxmlformats.org/officeDocument/2006/customXml" ds:itemID="{D998B7D1-CA50-49F7-935B-88C3B5106ED3}">
+<ds:datastoreItem xmlns:ds="http://schemas.openxmlformats.org/officeDocument/2006/customXml" ds:itemID="{D2D8D934-3720-4F68-AC3B-3C085B7399B0}">
   <ds:schemaRefs>
+    <ds:schemaRef ds:uri="http://schemas.microsoft.com/office/2006/metadata/contentType"/>
+    <ds:schemaRef ds:uri="http://schemas.microsoft.com/office/2006/metadata/properties/metaAttributes"/>
+    <ds:schemaRef ds:uri="http://www.w3.org/2001/XMLSchema"/>
     <ds:schemaRef ds:uri="http://schemas.microsoft.com/office/2006/metadata/properties"/>
-    <ds:schemaRef ds:uri="http://schemas.microsoft.com/office/infopath/2007/PartnerControls"/>
     <ds:schemaRef ds:uri="f20a0681-8b2f-4a46-9dab-cf1520193f81"/>
     <ds:schemaRef ds:uri="932fafb7-d8e0-4a14-bee3-33aad5c71309"/>
+    <ds:schemaRef ds:uri="http://schemas.microsoft.com/office/2006/documentManagement/types"/>
+    <ds:schemaRef ds:uri="http://schemas.microsoft.com/office/infopath/2007/PartnerControls"/>
+    <ds:schemaRef ds:uri="http://schemas.openxmlformats.org/package/2006/metadata/core-properties"/>
+    <ds:schemaRef ds:uri="http://purl.org/dc/elements/1.1/"/>
+    <ds:schemaRef ds:uri="http://purl.org/dc/terms/"/>
+    <ds:schemaRef ds:uri="http://schemas.microsoft.com/internal/obd"/>
   </ds:schemaRefs>
 </ds:datastoreItem>
 </file>
@@ -6679,5 +6884,12 @@
 </file>
 
 <file path=customXml/itemProps3.xml><?xml version="1.0" encoding="utf-8"?>
-<ds:datastoreItem xmlns:ds="http://schemas.openxmlformats.org/officeDocument/2006/customXml" ds:itemID="{D2D8D934-3720-4F68-AC3B-3C085B7399B0}"/>
+<ds:datastoreItem xmlns:ds="http://schemas.openxmlformats.org/officeDocument/2006/customXml" ds:itemID="{D998B7D1-CA50-49F7-935B-88C3B5106ED3}">
+  <ds:schemaRefs>
+    <ds:schemaRef ds:uri="http://schemas.microsoft.com/office/2006/metadata/properties"/>
+    <ds:schemaRef ds:uri="http://schemas.microsoft.com/office/infopath/2007/PartnerControls"/>
+    <ds:schemaRef ds:uri="f20a0681-8b2f-4a46-9dab-cf1520193f81"/>
+    <ds:schemaRef ds:uri="932fafb7-d8e0-4a14-bee3-33aad5c71309"/>
+  </ds:schemaRefs>
+</ds:datastoreItem>
 </file>
</xml_diff>